<commit_message>
Add MATH1201 peer responses; unify block-paragraph docx formatting
- MATH1201: draft peer responses to Mutinta, Min, and Kenneth (75+ words
  each, substantive, with questions and references)
- CS1103 & CS1105: bump block-paragraph gap to 10pt for clear visual
  separation, consistent with MATH1201 assignment formatting; regenerate docx
</commit_message>
<xml_diff>
--- a/CS1103_Programming_2/Unit1_Exception_String_Handling/Assignment/Unit1_Programming_Assignment.docx
+++ b/CS1103_Programming_2/Unit1_Exception_String_Handling/Assignment/Unit1_Programming_Assignment.docx
@@ -4,7 +4,7 @@
   <w:body>
     <w:p>
       <w:pPr>
-        <w:spacing w:line="360" w:lineRule="auto" w:after="120"/>
+        <w:spacing w:line="360" w:lineRule="auto" w:after="200"/>
         <w:ind w:firstLine="0"/>
       </w:pPr>
       <w:r>
@@ -17,7 +17,7 @@
     </w:p>
     <w:p>
       <w:pPr>
-        <w:spacing w:line="360" w:lineRule="auto" w:after="120"/>
+        <w:spacing w:line="360" w:lineRule="auto" w:after="200"/>
         <w:ind w:firstLine="0"/>
       </w:pPr>
       <w:r>
@@ -30,7 +30,7 @@
     </w:p>
     <w:p>
       <w:pPr>
-        <w:spacing w:line="360" w:lineRule="auto" w:after="120"/>
+        <w:spacing w:line="360" w:lineRule="auto" w:after="200"/>
         <w:ind w:firstLine="0"/>
       </w:pPr>
       <w:r>
@@ -43,7 +43,7 @@
     </w:p>
     <w:p>
       <w:pPr>
-        <w:spacing w:line="360" w:lineRule="auto" w:after="120"/>
+        <w:spacing w:line="360" w:lineRule="auto" w:after="200"/>
         <w:ind w:firstLine="0"/>
       </w:pPr>
       <w:r>
@@ -56,7 +56,7 @@
     </w:p>
     <w:p>
       <w:pPr>
-        <w:spacing w:line="360" w:lineRule="auto" w:after="120"/>
+        <w:spacing w:line="360" w:lineRule="auto" w:after="200"/>
         <w:ind w:firstLine="0"/>
         <w:jc w:val="center"/>
       </w:pPr>
@@ -71,7 +71,7 @@
     </w:p>
     <w:p>
       <w:pPr>
-        <w:spacing w:line="360" w:lineRule="auto" w:after="120"/>
+        <w:spacing w:line="360" w:lineRule="auto" w:after="200"/>
         <w:ind w:firstLine="0"/>
       </w:pPr>
       <w:r>
@@ -84,7 +84,7 @@
     </w:p>
     <w:p>
       <w:pPr>
-        <w:spacing w:line="360" w:lineRule="auto" w:after="120"/>
+        <w:spacing w:line="360" w:lineRule="auto" w:after="200"/>
         <w:ind w:firstLine="0"/>
         <w:jc w:val="center"/>
       </w:pPr>
@@ -99,7 +99,7 @@
     </w:p>
     <w:p>
       <w:pPr>
-        <w:spacing w:line="360" w:lineRule="auto" w:after="120"/>
+        <w:spacing w:line="360" w:lineRule="auto" w:after="200"/>
         <w:ind w:firstLine="0"/>
         <w:jc w:val="center"/>
       </w:pPr>
@@ -114,7 +114,7 @@
     </w:p>
     <w:p>
       <w:pPr>
-        <w:spacing w:line="360" w:lineRule="auto" w:after="120"/>
+        <w:spacing w:line="360" w:lineRule="auto" w:after="200"/>
         <w:ind w:firstLine="0"/>
         <w:jc w:val="center"/>
       </w:pPr>
@@ -129,7 +129,7 @@
     </w:p>
     <w:p>
       <w:pPr>
-        <w:spacing w:line="360" w:lineRule="auto" w:after="120"/>
+        <w:spacing w:line="360" w:lineRule="auto" w:after="200"/>
         <w:ind w:firstLine="0"/>
         <w:jc w:val="center"/>
       </w:pPr>
@@ -144,7 +144,7 @@
     </w:p>
     <w:p>
       <w:pPr>
-        <w:spacing w:line="360" w:lineRule="auto" w:after="120"/>
+        <w:spacing w:line="360" w:lineRule="auto" w:after="200"/>
         <w:ind w:firstLine="0"/>
         <w:jc w:val="center"/>
       </w:pPr>
@@ -195,7 +195,7 @@
     </w:p>
     <w:p>
       <w:pPr>
-        <w:spacing w:line="360" w:lineRule="auto" w:after="120"/>
+        <w:spacing w:line="360" w:lineRule="auto" w:after="200"/>
         <w:ind w:firstLine="0"/>
       </w:pPr>
       <w:r>
@@ -224,7 +224,7 @@
     </w:p>
     <w:p>
       <w:pPr>
-        <w:spacing w:line="360" w:lineRule="auto" w:after="120"/>
+        <w:spacing w:line="360" w:lineRule="auto" w:after="200"/>
         <w:ind w:firstLine="0"/>
       </w:pPr>
       <w:r>
@@ -4736,7 +4736,7 @@
     </w:p>
     <w:p>
       <w:pPr>
-        <w:spacing w:line="360" w:lineRule="auto" w:after="120"/>
+        <w:spacing w:line="360" w:lineRule="auto" w:after="200"/>
         <w:ind w:firstLine="0"/>
       </w:pPr>
       <w:r>
@@ -4792,7 +4792,7 @@
     </w:p>
     <w:p>
       <w:pPr>
-        <w:spacing w:line="360" w:lineRule="auto" w:after="120"/>
+        <w:spacing w:line="360" w:lineRule="auto" w:after="200"/>
         <w:ind w:firstLine="0"/>
       </w:pPr>
       <w:r>
@@ -4805,7 +4805,7 @@
     </w:p>
     <w:p>
       <w:pPr>
-        <w:spacing w:line="360" w:lineRule="auto" w:after="120"/>
+        <w:spacing w:line="360" w:lineRule="auto" w:after="200"/>
         <w:ind w:firstLine="0"/>
       </w:pPr>
       <w:r>
@@ -5040,7 +5040,7 @@
     </w:p>
     <w:p>
       <w:pPr>
-        <w:spacing w:line="360" w:lineRule="auto" w:after="120"/>
+        <w:spacing w:line="360" w:lineRule="auto" w:after="200"/>
         <w:ind w:firstLine="0"/>
       </w:pPr>
       <w:r>
@@ -5054,7 +5054,7 @@
     </w:p>
     <w:p>
       <w:pPr>
-        <w:spacing w:line="360" w:lineRule="auto" w:after="120"/>
+        <w:spacing w:line="360" w:lineRule="auto" w:after="200"/>
         <w:ind w:firstLine="0"/>
         <w:jc w:val="center"/>
       </w:pPr>
@@ -5069,7 +5069,7 @@
     </w:p>
     <w:p>
       <w:pPr>
-        <w:spacing w:line="360" w:lineRule="auto" w:after="120"/>
+        <w:spacing w:line="360" w:lineRule="auto" w:after="200"/>
         <w:ind w:firstLine="0"/>
       </w:pPr>
       <w:r>
@@ -5082,7 +5082,7 @@
     </w:p>
     <w:p>
       <w:pPr>
-        <w:spacing w:line="360" w:lineRule="auto" w:after="120"/>
+        <w:spacing w:line="360" w:lineRule="auto" w:after="200"/>
         <w:ind w:firstLine="0"/>
       </w:pPr>
       <w:r>
@@ -5096,7 +5096,7 @@
     </w:p>
     <w:p>
       <w:pPr>
-        <w:spacing w:line="360" w:lineRule="auto" w:after="120"/>
+        <w:spacing w:line="360" w:lineRule="auto" w:after="200"/>
         <w:ind w:firstLine="0"/>
         <w:jc w:val="center"/>
       </w:pPr>

</xml_diff>